<commit_message>
Update assignment 3, final project and redo of EER diagram
</commit_message>
<xml_diff>
--- a/Assignment 3/Assignment 3.docx
+++ b/Assignment 3/Assignment 3.docx
@@ -241,15 +241,7 @@
         </w:numPr>
       </w:pPr>
       <w:r>
-        <w:t xml:space="preserve">Two entities with a </w:t>
-      </w:r>
-      <w:proofErr w:type="gramStart"/>
-      <w:r>
-        <w:t>one to one</w:t>
-      </w:r>
-      <w:proofErr w:type="gramEnd"/>
-      <w:r>
-        <w:t xml:space="preserve"> relationships can be denormalized into a single entity</w:t>
+        <w:t>Two entities with a one to one relationships can be denormalized into a single entity</w:t>
       </w:r>
       <w:r>
         <w:t>, as it can reduce unnecessary joins, and does not</w:t>
@@ -411,15 +403,7 @@
         <w:t xml:space="preserve"> is data that </w:t>
       </w:r>
       <w:r>
-        <w:t xml:space="preserve">exists in one to many </w:t>
-      </w:r>
-      <w:proofErr w:type="gramStart"/>
-      <w:r>
-        <w:t>relationships, and</w:t>
-      </w:r>
-      <w:proofErr w:type="gramEnd"/>
-      <w:r>
-        <w:t xml:space="preserve"> </w:t>
+        <w:t xml:space="preserve">exists in one to many relationships, and </w:t>
       </w:r>
       <w:r>
         <w:t xml:space="preserve">does not frequently change.  If the table is rarely changed and constantly queried, then it’s a good candidate to include as additional attributes of the table.  An example of this could be a car dealerships </w:t>
@@ -490,15 +474,7 @@
         <w:t xml:space="preserve">arrangements. This </w:t>
       </w:r>
       <w:r>
-        <w:t xml:space="preserve">can improve performance of data </w:t>
-      </w:r>
-      <w:proofErr w:type="gramStart"/>
-      <w:r>
-        <w:t>sets, and</w:t>
-      </w:r>
-      <w:proofErr w:type="gramEnd"/>
-      <w:r>
-        <w:t xml:space="preserve"> make them more manageable.</w:t>
+        <w:t>can improve performance of data sets, and make them more manageable.</w:t>
       </w:r>
     </w:p>
     <w:p>
@@ -526,49 +502,57 @@
           <w:b/>
           <w:bCs/>
         </w:rPr>
-        <w:t>H</w:t>
+        <w:t>Vertical</w:t>
       </w:r>
       <w:r>
         <w:rPr>
           <w:b/>
           <w:bCs/>
         </w:rPr>
-        <w:t>orizon</w:t>
+        <w:t xml:space="preserve"> </w:t>
       </w:r>
       <w:r>
         <w:rPr>
           <w:b/>
           <w:bCs/>
         </w:rPr>
-        <w:t>t</w:t>
-      </w:r>
-      <w:r>
-        <w:rPr>
-          <w:b/>
-          <w:bCs/>
-        </w:rPr>
-        <w:t xml:space="preserve">al </w:t>
-      </w:r>
-      <w:r>
-        <w:rPr>
-          <w:b/>
-          <w:bCs/>
-        </w:rPr>
         <w:t>partitioning</w:t>
       </w:r>
       <w:r>
-        <w:t xml:space="preserve">, where data columns that describe the same entity are split across multiple tables.  One advantage of this is if </w:t>
-      </w:r>
-      <w:r>
-        <w:t xml:space="preserve">certain records of an entity are infrequently queried, or changed, </w:t>
-      </w:r>
-      <w:proofErr w:type="gramStart"/>
-      <w:r>
-        <w:t>than</w:t>
-      </w:r>
-      <w:proofErr w:type="gramEnd"/>
-      <w:r>
-        <w:t xml:space="preserve"> they can be left out of the more frequently accessed or altered data.</w:t>
+        <w:t xml:space="preserve">, where </w:t>
+      </w:r>
+      <w:r>
+        <w:t xml:space="preserve">a large table with many </w:t>
+      </w:r>
+      <w:r>
+        <w:t xml:space="preserve">columns </w:t>
+      </w:r>
+      <w:r>
+        <w:t>is split into multiple tables across columns</w:t>
+      </w:r>
+      <w:r>
+        <w:t xml:space="preserve">. </w:t>
+      </w:r>
+      <w:r>
+        <w:t xml:space="preserve">This can be very advantageous because </w:t>
+      </w:r>
+      <w:r>
+        <w:t xml:space="preserve">if </w:t>
+      </w:r>
+      <w:r>
+        <w:t xml:space="preserve">certain </w:t>
+      </w:r>
+      <w:r>
+        <w:t>columns or pieces of data</w:t>
+      </w:r>
+      <w:r>
+        <w:t xml:space="preserve"> of an entity are infrequently queried, or changed, than they can be left out of the more frequently accessed or altered data</w:t>
+      </w:r>
+      <w:r>
+        <w:t>.</w:t>
+      </w:r>
+      <w:r>
+        <w:t xml:space="preserve"> </w:t>
       </w:r>
     </w:p>
     <w:p>
@@ -588,7 +572,7 @@
           <w:b/>
           <w:bCs/>
         </w:rPr>
-        <w:t>Vertical</w:t>
+        <w:t>Horizontal</w:t>
       </w:r>
       <w:r>
         <w:rPr>
@@ -597,7 +581,6 @@
         </w:rPr>
         <w:t xml:space="preserve"> </w:t>
       </w:r>
-      <w:proofErr w:type="gramStart"/>
       <w:r>
         <w:rPr>
           <w:b/>
@@ -613,22 +596,19 @@
         <w:t xml:space="preserve"> </w:t>
       </w:r>
       <w:r>
-        <w:t xml:space="preserve"> is</w:t>
-      </w:r>
-      <w:proofErr w:type="gramEnd"/>
+        <w:t>is</w:t>
+      </w:r>
       <w:r>
         <w:t xml:space="preserve"> the splitting of data by rows</w:t>
       </w:r>
       <w:r>
-        <w:t xml:space="preserve"> into multiple tables.  This is most effective when tables contain extreme large data sets. </w:t>
-      </w:r>
-      <w:proofErr w:type="spellStart"/>
-      <w:r>
-        <w:t>Partitioninig</w:t>
-      </w:r>
-      <w:proofErr w:type="spellEnd"/>
-      <w:r>
-        <w:t xml:space="preserve"> can be done by date, identity or identifier, or ranges</w:t>
+        <w:t xml:space="preserve"> into multiple tables</w:t>
+      </w:r>
+      <w:r>
+        <w:t>, taking a large data set into several smaller ones.  The definition of the data remains the same, each table contains the same columns</w:t>
+      </w:r>
+      <w:r>
+        <w:t>.  This is most effective when tables contain extreme large data sets. Partitioninig can be done by date, identity or identifier, or ranges</w:t>
       </w:r>
       <w:r>
         <w:t xml:space="preserve"> or more. Splitting a very large data set into smaller data sets can improve performance of both querying and modifying data.</w:t>
@@ -651,6 +631,7 @@
         <w:pStyle w:val="Heading2"/>
       </w:pPr>
       <w:r>
+        <w:lastRenderedPageBreak/>
         <w:t xml:space="preserve">2. </w:t>
       </w:r>
       <w:r>
@@ -677,7 +658,6 @@
         </w:numPr>
       </w:pPr>
       <w:r>
-        <w:lastRenderedPageBreak/>
         <w:t>What factors should be considered when choosing a file organization?</w:t>
       </w:r>
     </w:p>
@@ -913,15 +893,7 @@
       </w:r>
       <w:proofErr w:type="spellEnd"/>
       <w:r>
-        <w:t xml:space="preserve"> file addressing based on </w:t>
-      </w:r>
-      <w:proofErr w:type="gramStart"/>
-      <w:r>
-        <w:t>an</w:t>
-      </w:r>
-      <w:proofErr w:type="gramEnd"/>
-      <w:r>
-        <w:t xml:space="preserve"> hashing algorithm.</w:t>
+        <w:t xml:space="preserve"> file addressing based on an hashing algorithm.</w:t>
       </w:r>
       <w:r>
         <w:t xml:space="preserve"> </w:t>
@@ -1081,6 +1053,7 @@
           <w:sz w:val="20"/>
           <w:szCs w:val="20"/>
         </w:rPr>
+        <w:lastRenderedPageBreak/>
         <w:t xml:space="preserve">SQL: </w:t>
       </w:r>
     </w:p>
@@ -1123,7 +1096,6 @@
           <w:sz w:val="20"/>
           <w:szCs w:val="20"/>
         </w:rPr>
-        <w:lastRenderedPageBreak/>
         <w:t xml:space="preserve">  </w:t>
       </w:r>
       <w:proofErr w:type="spellStart"/>
@@ -1206,7 +1178,6 @@
         <w:t xml:space="preserve">, </w:t>
       </w:r>
       <w:proofErr w:type="spellStart"/>
-      <w:proofErr w:type="gramStart"/>
       <w:r>
         <w:rPr>
           <w:rFonts w:ascii="Courier New" w:hAnsi="Courier New" w:cs="Courier New"/>
@@ -1216,7 +1187,6 @@
         <w:t>proj.location</w:t>
       </w:r>
       <w:proofErr w:type="spellEnd"/>
-      <w:proofErr w:type="gramEnd"/>
       <w:r>
         <w:rPr>
           <w:rFonts w:ascii="Courier New" w:hAnsi="Courier New" w:cs="Courier New"/>
@@ -1244,7 +1214,6 @@
         <w:t xml:space="preserve">, </w:t>
       </w:r>
       <w:proofErr w:type="spellStart"/>
-      <w:proofErr w:type="gramStart"/>
       <w:r>
         <w:rPr>
           <w:rFonts w:ascii="Courier New" w:hAnsi="Courier New" w:cs="Courier New"/>
@@ -1270,7 +1239,6 @@
         <w:t>.worked</w:t>
       </w:r>
       <w:proofErr w:type="spellEnd"/>
-      <w:proofErr w:type="gramEnd"/>
       <w:r>
         <w:rPr>
           <w:rFonts w:ascii="Courier New" w:hAnsi="Courier New" w:cs="Courier New"/>
@@ -1436,114 +1404,109 @@
         <w:t xml:space="preserve"> on </w:t>
       </w:r>
       <w:proofErr w:type="spellStart"/>
-      <w:proofErr w:type="gramStart"/>
       <w:r>
         <w:rPr>
           <w:rFonts w:ascii="Courier New" w:hAnsi="Courier New" w:cs="Courier New"/>
           <w:sz w:val="20"/>
           <w:szCs w:val="20"/>
         </w:rPr>
-        <w:t>pa.proj</w:t>
-      </w:r>
-      <w:proofErr w:type="gramEnd"/>
+        <w:t>pa.proj_no</w:t>
+      </w:r>
+      <w:proofErr w:type="spellEnd"/>
       <w:r>
         <w:rPr>
           <w:rFonts w:ascii="Courier New" w:hAnsi="Courier New" w:cs="Courier New"/>
           <w:sz w:val="20"/>
           <w:szCs w:val="20"/>
         </w:rPr>
-        <w:t>_no</w:t>
-      </w:r>
-      <w:proofErr w:type="spellEnd"/>
+        <w:t xml:space="preserve"> = </w:t>
+      </w:r>
+      <w:proofErr w:type="spellStart"/>
       <w:r>
         <w:rPr>
           <w:rFonts w:ascii="Courier New" w:hAnsi="Courier New" w:cs="Courier New"/>
           <w:sz w:val="20"/>
           <w:szCs w:val="20"/>
         </w:rPr>
-        <w:t xml:space="preserve"> = </w:t>
-      </w:r>
-      <w:proofErr w:type="spellStart"/>
-      <w:proofErr w:type="gramStart"/>
-      <w:r>
+        <w:t>proj.proj_no</w:t>
+      </w:r>
+      <w:proofErr w:type="spellEnd"/>
+    </w:p>
+    <w:p>
+      <w:pPr>
         <w:rPr>
           <w:rFonts w:ascii="Courier New" w:hAnsi="Courier New" w:cs="Courier New"/>
           <w:sz w:val="20"/>
           <w:szCs w:val="20"/>
         </w:rPr>
-        <w:t>proj.proj</w:t>
-      </w:r>
-      <w:proofErr w:type="gramEnd"/>
+      </w:pPr>
       <w:r>
         <w:rPr>
           <w:rFonts w:ascii="Courier New" w:hAnsi="Courier New" w:cs="Courier New"/>
           <w:sz w:val="20"/>
           <w:szCs w:val="20"/>
         </w:rPr>
-        <w:t>_no</w:t>
-      </w:r>
-      <w:proofErr w:type="spellEnd"/>
-    </w:p>
-    <w:p>
-      <w:pPr>
+        <w:t xml:space="preserve">where </w:t>
+      </w:r>
+      <w:proofErr w:type="spellStart"/>
+      <w:r>
         <w:rPr>
           <w:rFonts w:ascii="Courier New" w:hAnsi="Courier New" w:cs="Courier New"/>
           <w:sz w:val="20"/>
           <w:szCs w:val="20"/>
         </w:rPr>
-      </w:pPr>
+        <w:t>emp.salary</w:t>
+      </w:r>
+      <w:proofErr w:type="spellEnd"/>
       <w:r>
         <w:rPr>
           <w:rFonts w:ascii="Courier New" w:hAnsi="Courier New" w:cs="Courier New"/>
           <w:sz w:val="20"/>
           <w:szCs w:val="20"/>
         </w:rPr>
-        <w:t xml:space="preserve">where </w:t>
-      </w:r>
-      <w:proofErr w:type="spellStart"/>
-      <w:proofErr w:type="gramStart"/>
-      <w:r>
+        <w:t xml:space="preserve"> &gt; 66000</w:t>
+      </w:r>
+    </w:p>
+    <w:p>
+      <w:pPr>
         <w:rPr>
           <w:rFonts w:ascii="Courier New" w:hAnsi="Courier New" w:cs="Courier New"/>
           <w:sz w:val="20"/>
           <w:szCs w:val="20"/>
         </w:rPr>
-        <w:t>emp.salary</w:t>
-      </w:r>
-      <w:proofErr w:type="spellEnd"/>
-      <w:proofErr w:type="gramEnd"/>
+      </w:pPr>
       <w:r>
         <w:rPr>
           <w:rFonts w:ascii="Courier New" w:hAnsi="Courier New" w:cs="Courier New"/>
           <w:sz w:val="20"/>
           <w:szCs w:val="20"/>
         </w:rPr>
-        <w:t xml:space="preserve"> &gt; 66000</w:t>
-      </w:r>
-    </w:p>
-    <w:p>
-      <w:pPr>
+        <w:t xml:space="preserve">order by </w:t>
+      </w:r>
+      <w:r>
         <w:rPr>
           <w:rFonts w:ascii="Courier New" w:hAnsi="Courier New" w:cs="Courier New"/>
           <w:sz w:val="20"/>
           <w:szCs w:val="20"/>
         </w:rPr>
-      </w:pPr>
+        <w:t>emp.</w:t>
+      </w:r>
       <w:r>
         <w:rPr>
           <w:rFonts w:ascii="Courier New" w:hAnsi="Courier New" w:cs="Courier New"/>
           <w:sz w:val="20"/>
           <w:szCs w:val="20"/>
         </w:rPr>
-        <w:t xml:space="preserve">order by </w:t>
-      </w:r>
+        <w:t xml:space="preserve">name </w:t>
+      </w:r>
+      <w:proofErr w:type="spellStart"/>
       <w:r>
         <w:rPr>
           <w:rFonts w:ascii="Courier New" w:hAnsi="Courier New" w:cs="Courier New"/>
           <w:sz w:val="20"/>
           <w:szCs w:val="20"/>
         </w:rPr>
-        <w:t>emp.</w:t>
+        <w:t>a</w:t>
       </w:r>
       <w:r>
         <w:rPr>
@@ -1551,8 +1514,9 @@
           <w:sz w:val="20"/>
           <w:szCs w:val="20"/>
         </w:rPr>
-        <w:t>name desc</w:t>
-      </w:r>
+        <w:t>sc</w:t>
+      </w:r>
+      <w:proofErr w:type="spellEnd"/>
       <w:r>
         <w:rPr>
           <w:rFonts w:ascii="Courier New" w:hAnsi="Courier New" w:cs="Courier New"/>
@@ -1642,7 +1606,23 @@
           <w:sz w:val="18"/>
           <w:szCs w:val="18"/>
         </w:rPr>
-        <w:t xml:space="preserve"> on emp (</w:t>
+        <w:t xml:space="preserve"> on </w:t>
+      </w:r>
+      <w:r>
+        <w:rPr>
+          <w:rFonts w:ascii="Courier New" w:hAnsi="Courier New" w:cs="Courier New"/>
+          <w:sz w:val="18"/>
+          <w:szCs w:val="18"/>
+        </w:rPr>
+        <w:t>Employee</w:t>
+      </w:r>
+      <w:r>
+        <w:rPr>
+          <w:rFonts w:ascii="Courier New" w:hAnsi="Courier New" w:cs="Courier New"/>
+          <w:sz w:val="18"/>
+          <w:szCs w:val="18"/>
+        </w:rPr>
+        <w:t xml:space="preserve"> (</w:t>
       </w:r>
       <w:proofErr w:type="spellStart"/>
       <w:r>
@@ -1772,7 +1752,23 @@
           <w:sz w:val="18"/>
           <w:szCs w:val="18"/>
         </w:rPr>
-        <w:t xml:space="preserve"> on emp (name) </w:t>
+        <w:t xml:space="preserve"> on </w:t>
+      </w:r>
+      <w:r>
+        <w:rPr>
+          <w:rFonts w:ascii="Courier New" w:hAnsi="Courier New" w:cs="Courier New"/>
+          <w:sz w:val="18"/>
+          <w:szCs w:val="18"/>
+        </w:rPr>
+        <w:t>Employee</w:t>
+      </w:r>
+      <w:r>
+        <w:rPr>
+          <w:rFonts w:ascii="Courier New" w:hAnsi="Courier New" w:cs="Courier New"/>
+          <w:sz w:val="18"/>
+          <w:szCs w:val="18"/>
+        </w:rPr>
+        <w:t xml:space="preserve"> (name) </w:t>
       </w:r>
       <w:r>
         <w:rPr>
@@ -1804,25 +1800,7 @@
           <w:sz w:val="18"/>
           <w:szCs w:val="18"/>
         </w:rPr>
-        <w:t xml:space="preserve">an optional column that </w:t>
-      </w:r>
-      <w:proofErr w:type="gramStart"/>
-      <w:r>
-        <w:rPr>
-          <w:rFonts w:ascii="Courier New" w:hAnsi="Courier New" w:cs="Courier New"/>
-          <w:sz w:val="18"/>
-          <w:szCs w:val="18"/>
-        </w:rPr>
-        <w:t>can</w:t>
-      </w:r>
-      <w:proofErr w:type="gramEnd"/>
-      <w:r>
-        <w:rPr>
-          <w:rFonts w:ascii="Courier New" w:hAnsi="Courier New" w:cs="Courier New"/>
-          <w:sz w:val="18"/>
-          <w:szCs w:val="18"/>
-        </w:rPr>
-        <w:t xml:space="preserve"> assi</w:t>
+        <w:t>an optional column that can assi</w:t>
       </w:r>
       <w:r>
         <w:rPr>
@@ -1916,17 +1894,14 @@
         </w:rPr>
         <w:t xml:space="preserve"> on </w:t>
       </w:r>
-      <w:proofErr w:type="spellStart"/>
-      <w:proofErr w:type="gramStart"/>
-      <w:r>
-        <w:rPr>
-          <w:rFonts w:ascii="Courier New" w:hAnsi="Courier New" w:cs="Courier New"/>
-          <w:sz w:val="18"/>
-          <w:szCs w:val="18"/>
-        </w:rPr>
-        <w:t>proj</w:t>
-      </w:r>
-      <w:proofErr w:type="spellEnd"/>
+      <w:r>
+        <w:rPr>
+          <w:rFonts w:ascii="Courier New" w:hAnsi="Courier New" w:cs="Courier New"/>
+          <w:sz w:val="18"/>
+          <w:szCs w:val="18"/>
+        </w:rPr>
+        <w:t>Project</w:t>
+      </w:r>
       <w:r>
         <w:rPr>
           <w:rFonts w:ascii="Courier New" w:hAnsi="Courier New" w:cs="Courier New"/>
@@ -1936,7 +1911,6 @@
         <w:t xml:space="preserve">  (</w:t>
       </w:r>
       <w:proofErr w:type="spellStart"/>
-      <w:proofErr w:type="gramEnd"/>
       <w:r>
         <w:rPr>
           <w:rFonts w:ascii="Courier New" w:hAnsi="Courier New" w:cs="Courier New"/>
@@ -1970,23 +1944,13 @@
         </w:rPr>
         <w:t>--</w:t>
       </w:r>
-      <w:proofErr w:type="gramStart"/>
-      <w:r>
-        <w:rPr>
-          <w:rFonts w:ascii="Courier New" w:hAnsi="Courier New" w:cs="Courier New"/>
-          <w:sz w:val="18"/>
-          <w:szCs w:val="18"/>
-        </w:rPr>
-        <w:t>Similar to</w:t>
-      </w:r>
-      <w:proofErr w:type="gramEnd"/>
-      <w:r>
-        <w:rPr>
-          <w:rFonts w:ascii="Courier New" w:hAnsi="Courier New" w:cs="Courier New"/>
-          <w:sz w:val="18"/>
-          <w:szCs w:val="18"/>
-        </w:rPr>
-        <w:t xml:space="preserve"> </w:t>
+      <w:r>
+        <w:rPr>
+          <w:rFonts w:ascii="Courier New" w:hAnsi="Courier New" w:cs="Courier New"/>
+          <w:sz w:val="18"/>
+          <w:szCs w:val="18"/>
+        </w:rPr>
+        <w:t xml:space="preserve">Similar to </w:t>
       </w:r>
       <w:proofErr w:type="spellStart"/>
       <w:r>
@@ -2278,18 +2242,14 @@
         <w:t>The EFT data being transmitted by the EFT system with the various branches must be protected against interception, interruption</w:t>
       </w:r>
       <w:r>
-        <w:t xml:space="preserve"> and reception. That means that the data must get through, without anyone being able to interrupt the process, alter the contents of the data, or be able to capture or read the data. This should be done by </w:t>
-      </w:r>
-      <w:r>
-        <w:t xml:space="preserve">protecting the means of communication between the two systems; if </w:t>
-      </w:r>
-      <w:proofErr w:type="gramStart"/>
-      <w:r>
-        <w:t>possible</w:t>
-      </w:r>
-      <w:proofErr w:type="gramEnd"/>
-      <w:r>
-        <w:t xml:space="preserve"> it should be an air-gapped direct physical connection, disconnected from any public</w:t>
+        <w:t xml:space="preserve"> and reception. That means that the data must get through, without anyone being able to interrupt the process, alter the contents of the data, or be able to </w:t>
+      </w:r>
+      <w:r>
+        <w:lastRenderedPageBreak/>
+        <w:t xml:space="preserve">capture or read the data. This should be done by </w:t>
+      </w:r>
+      <w:r>
+        <w:t>protecting the means of communication between the two systems; if possible it should be an air-gapped direct physical connection, disconnected from any public</w:t>
       </w:r>
       <w:r>
         <w:t xml:space="preserve"> </w:t>
@@ -2298,11 +2258,7 @@
         <w:t xml:space="preserve">networks. If public infrastructure must be used, such as the internet, then </w:t>
       </w:r>
       <w:r>
-        <w:t xml:space="preserve">an </w:t>
-      </w:r>
-      <w:r>
-        <w:lastRenderedPageBreak/>
-        <w:t>encrypted connection is a must, ideally involving a dedicated virtual private network.  Connection filtering, authorization and authentication should be involved, such as; verifying IP address, MAC address</w:t>
+        <w:t>an encrypted connection is a must, ideally involving a dedicated virtual private network.  Connection filtering, authorization and authentication should be involved, such as; verifying IP address, MAC address</w:t>
       </w:r>
       <w:r>
         <w:t>, username / password / token / key or other form of authentication, and authorization, which is the process of identifying the connector (such as a branch) and ensuring</w:t>
@@ -2367,21 +2323,11 @@
         <w:t xml:space="preserve">If the </w:t>
       </w:r>
       <w:r>
-        <w:t xml:space="preserve">company doesn’t want to issue permanent keys to the employees, a password or biometric verification would be the best option.  A password could be enabled or disabled easily </w:t>
-      </w:r>
-      <w:proofErr w:type="gramStart"/>
-      <w:r>
-        <w:t>remotely, and</w:t>
-      </w:r>
-      <w:proofErr w:type="gramEnd"/>
-      <w:r>
-        <w:t xml:space="preserve"> not require that the employee have any physical key. Another option would be to use employee biometric information such as a </w:t>
-      </w:r>
-      <w:proofErr w:type="gramStart"/>
-      <w:r>
-        <w:t>finger print</w:t>
-      </w:r>
-      <w:proofErr w:type="gramEnd"/>
+        <w:t xml:space="preserve">company doesn’t want to issue permanent keys to the employees, a password or biometric verification would be the best option.  A password could be enabled or disabled easily remotely, and not require that the employee have any physical key. Another option would be to use employee biometric information such as a </w:t>
+      </w:r>
+      <w:r>
+        <w:t>fingerprint</w:t>
+      </w:r>
       <w:r>
         <w:t>, voice confirmation, or retina scan to authenticate the user against</w:t>
       </w:r>
@@ -2439,7 +2385,33 @@
         <w:t xml:space="preserve"> assign each user a password. Do not share the ‘simple’ database password</w:t>
       </w:r>
       <w:r>
-        <w:t>, it would be used only for authentication between the database and the golf system application.  It would also be best practice to implement additional connection authentication checks such as address filtering, VPN connection etc.</w:t>
+        <w:t xml:space="preserve">, it would be used only for authentication between the database and the golf system application.  </w:t>
+      </w:r>
+      <w:r>
+        <w:t xml:space="preserve">If possible, and feasible, it’d be ideal to apply </w:t>
+      </w:r>
+      <w:r>
+        <w:t>roles-based</w:t>
+      </w:r>
+      <w:r>
+        <w:t xml:space="preserve"> permissions, implementing a least permission methodology, and actively </w:t>
+      </w:r>
+      <w:r>
+        <w:t>maintaining</w:t>
+      </w:r>
+      <w:r>
+        <w:t xml:space="preserve"> the user list; revoking permissions and roles when a user leaves the group.  </w:t>
+      </w:r>
+      <w:r>
+        <w:t xml:space="preserve">It would also be best practice to implement additional connection authentication checks such as address filtering, VPN connection </w:t>
+      </w:r>
+      <w:proofErr w:type="spellStart"/>
+      <w:r>
+        <w:t>etc</w:t>
+      </w:r>
+      <w:proofErr w:type="spellEnd"/>
+      <w:r>
+        <w:t xml:space="preserve"> and thorough auditing of all connections and actions.</w:t>
       </w:r>
     </w:p>
     <w:p>
@@ -2447,6 +2419,7 @@
         <w:pStyle w:val="Heading2"/>
       </w:pPr>
       <w:r>
+        <w:lastRenderedPageBreak/>
         <w:t xml:space="preserve">5. </w:t>
       </w:r>
       <w:r>
@@ -2503,55 +2476,23 @@
         <w:t xml:space="preserve">Depending on the database and </w:t>
       </w:r>
       <w:r>
-        <w:t xml:space="preserve">hardware configuration, some or </w:t>
-      </w:r>
-      <w:proofErr w:type="gramStart"/>
-      <w:r>
-        <w:t>all of</w:t>
-      </w:r>
-      <w:proofErr w:type="gramEnd"/>
-      <w:r>
-        <w:t xml:space="preserve"> the database and transaction can be restored.</w:t>
+        <w:t>hardware configuration, some or all of the database and transaction can be restored.</w:t>
       </w:r>
       <w:r>
         <w:t xml:space="preserve">  If the storage device that the database is installed on supports RAID mirroring, then </w:t>
       </w:r>
       <w:r>
-        <w:t xml:space="preserve">it should be possible to restore the database to the last successful </w:t>
-      </w:r>
-      <w:proofErr w:type="gramStart"/>
-      <w:r>
-        <w:t>write, and</w:t>
-      </w:r>
-      <w:proofErr w:type="gramEnd"/>
-      <w:r>
-        <w:t xml:space="preserve"> use the </w:t>
-      </w:r>
-      <w:proofErr w:type="gramStart"/>
-      <w:r>
-        <w:t>in memory</w:t>
-      </w:r>
-      <w:proofErr w:type="gramEnd"/>
-      <w:r>
-        <w:t xml:space="preserve"> transaction log to restore the last executed SQL command.</w:t>
+        <w:t>it should be possible to restore the database to the last successful write, and use the in memory transaction log to restore the last executed SQL command.</w:t>
       </w:r>
       <w:r>
         <w:t xml:space="preserve">  That would be an ideal situation and require a very specific set of conditions.  </w:t>
       </w:r>
       <w:r>
         <w:br/>
-      </w:r>
-      <w:r>
-        <w:lastRenderedPageBreak/>
         <w:t xml:space="preserve">Database best practices </w:t>
       </w:r>
-      <w:proofErr w:type="gramStart"/>
-      <w:r>
-        <w:t>calls</w:t>
-      </w:r>
-      <w:proofErr w:type="gramEnd"/>
-      <w:r>
-        <w:t xml:space="preserve"> for externally stored full backups to be run on a regular basis and partial backups on a very frequent basis. If the database is so negatively impacted by the drive failure, </w:t>
+      <w:r>
+        <w:t xml:space="preserve">calls for externally stored full backups to be run on a regular basis and partial backups on a very frequent basis. If the database is so negatively impacted by the drive failure, </w:t>
       </w:r>
       <w:r>
         <w:t xml:space="preserve">then a recent backup can be restored from the external source.  </w:t>
@@ -2646,15 +2587,7 @@
         <w:t xml:space="preserve">Unfortunately </w:t>
       </w:r>
       <w:r>
-        <w:t xml:space="preserve">recovering changes to a database after a backup was taken, and without any journaling, then </w:t>
-      </w:r>
-      <w:proofErr w:type="gramStart"/>
-      <w:r>
-        <w:t>its</w:t>
-      </w:r>
-      <w:proofErr w:type="gramEnd"/>
-      <w:r>
-        <w:t xml:space="preserve"> </w:t>
+        <w:t xml:space="preserve">recovering changes to a database after a backup was taken, and without any journaling, then its </w:t>
       </w:r>
       <w:r>
         <w:t>almost impossible</w:t>
@@ -2711,6 +2644,7 @@
         <w:pStyle w:val="ListParagraph"/>
       </w:pPr>
       <w:r>
+        <w:lastRenderedPageBreak/>
         <w:t xml:space="preserve">A data warehouse is a </w:t>
       </w:r>
       <w:r>
@@ -2723,13 +2657,40 @@
         <w:t xml:space="preserve">, structured data repository used for analysis </w:t>
       </w:r>
       <w:r>
-        <w:t xml:space="preserve">and decision making. A data mart is a department specific subset of a data </w:t>
+        <w:t xml:space="preserve">and decision making. A data mart is a </w:t>
+      </w:r>
+      <w:r>
+        <w:t>much more limited in scope version of data</w:t>
+      </w:r>
+      <w:r>
+        <w:t xml:space="preserve"> </w:t>
+      </w:r>
+      <w:r>
+        <w:t xml:space="preserve">warehouse, often focusing on a </w:t>
+      </w:r>
+      <w:r>
+        <w:t xml:space="preserve">department </w:t>
+      </w:r>
+      <w:r>
+        <w:t xml:space="preserve">or </w:t>
+      </w:r>
+      <w:r>
+        <w:t xml:space="preserve">specific subset of a data </w:t>
       </w:r>
       <w:r>
         <w:t>warehouse</w:t>
       </w:r>
       <w:r>
         <w:t>.</w:t>
+      </w:r>
+      <w:r>
+        <w:t xml:space="preserve">  Data marts are designed to optimize the performance for well-defined </w:t>
+      </w:r>
+      <w:r>
+        <w:t xml:space="preserve">and predictable uses.  </w:t>
+      </w:r>
+      <w:r>
+        <w:br/>
       </w:r>
     </w:p>
     <w:p>
@@ -2790,19 +2751,7 @@
         <w:t xml:space="preserve">one involves keeping a copy of the data locally; data propagation.  Each </w:t>
       </w:r>
       <w:r>
-        <w:t xml:space="preserve">approach can be appropriate depending on the situation. If the external source data is always available and retrieval isn’t to resource expensive, then it would be the best situation, as there is only a </w:t>
-      </w:r>
-      <w:r>
-        <w:lastRenderedPageBreak/>
-        <w:t xml:space="preserve">single source of truth.  </w:t>
-      </w:r>
-      <w:proofErr w:type="gramStart"/>
-      <w:r>
-        <w:t>If</w:t>
-      </w:r>
-      <w:proofErr w:type="gramEnd"/>
-      <w:r>
-        <w:t xml:space="preserve"> however, retrieval of that data </w:t>
+        <w:t xml:space="preserve">approach can be appropriate depending on the situation. If the external source data is always available and retrieval isn’t to resource expensive, then it would be the best situation, as there is only a single source of truth.  If however, retrieval of that data </w:t>
       </w:r>
       <w:r>
         <w:t>is either slow, or not 100% available, then taking a copy would be a good option, in which case propagation should be used.</w:t>
@@ -2981,7 +2930,6 @@
         <w:rPr>
           <w:highlight w:val="yellow"/>
         </w:rPr>
-        <w:lastRenderedPageBreak/>
         <w:t xml:space="preserve"> </w:t>
       </w:r>
     </w:p>
@@ -3021,12 +2969,10 @@
           <w:numId w:val="8"/>
         </w:numPr>
       </w:pPr>
-      <w:proofErr w:type="gramStart"/>
       <w:r>
         <w:t>Member(</w:t>
       </w:r>
       <w:proofErr w:type="spellStart"/>
-      <w:proofErr w:type="gramEnd"/>
       <w:r>
         <w:t>member_ID</w:t>
       </w:r>
@@ -3056,7 +3002,6 @@
         </w:numPr>
       </w:pPr>
       <w:proofErr w:type="spellStart"/>
-      <w:proofErr w:type="gramStart"/>
       <w:r>
         <w:t>InsuredItem</w:t>
       </w:r>
@@ -3065,7 +3010,6 @@
         <w:t>(</w:t>
       </w:r>
       <w:proofErr w:type="spellStart"/>
-      <w:proofErr w:type="gramEnd"/>
       <w:r>
         <w:t>Item_ID</w:t>
       </w:r>
@@ -3097,7 +3041,6 @@
         </w:numPr>
       </w:pPr>
       <w:proofErr w:type="spellStart"/>
-      <w:proofErr w:type="gramStart"/>
       <w:r>
         <w:t>CoopOffice</w:t>
       </w:r>
@@ -3106,7 +3049,6 @@
         <w:t>(</w:t>
       </w:r>
       <w:proofErr w:type="spellStart"/>
-      <w:proofErr w:type="gramEnd"/>
       <w:r>
         <w:t>Office_ID</w:t>
       </w:r>
@@ -3137,12 +3079,10 @@
           <w:numId w:val="8"/>
         </w:numPr>
       </w:pPr>
-      <w:proofErr w:type="gramStart"/>
       <w:r>
         <w:t>Policy(</w:t>
       </w:r>
       <w:proofErr w:type="spellStart"/>
-      <w:proofErr w:type="gramEnd"/>
       <w:r>
         <w:t>Policy_ID</w:t>
       </w:r>
@@ -3165,12 +3105,10 @@
           <w:numId w:val="8"/>
         </w:numPr>
       </w:pPr>
-      <w:proofErr w:type="gramStart"/>
       <w:r>
         <w:t>Period(</w:t>
       </w:r>
       <w:proofErr w:type="spellStart"/>
-      <w:proofErr w:type="gramEnd"/>
       <w:r>
         <w:t>Date_Key</w:t>
       </w:r>
@@ -3201,12 +3139,10 @@
           <w:numId w:val="8"/>
         </w:numPr>
       </w:pPr>
-      <w:proofErr w:type="gramStart"/>
       <w:r>
         <w:t>Claim(</w:t>
       </w:r>
       <w:proofErr w:type="spellStart"/>
-      <w:proofErr w:type="gramEnd"/>
       <w:r>
         <w:t>Claim_ID</w:t>
       </w:r>
@@ -3282,6 +3218,7 @@
     <w:p>
       <w:proofErr w:type="spellStart"/>
       <w:r>
+        <w:lastRenderedPageBreak/>
         <w:t>Member_ID</w:t>
       </w:r>
       <w:proofErr w:type="spellEnd"/>
@@ -3353,7 +3290,6 @@
         <w:rPr>
           <w:noProof/>
         </w:rPr>
-        <w:lastRenderedPageBreak/>
         <w:drawing>
           <wp:inline distT="0" distB="0" distL="0" distR="0" wp14:anchorId="13513FA9" wp14:editId="399C0E4A">
             <wp:extent cx="5789981" cy="3676346"/>
@@ -3559,6 +3495,7 @@
     </w:p>
     <w:p>
       <w:r>
+        <w:lastRenderedPageBreak/>
         <w:t xml:space="preserve">9 fields x 5 bytes = 45 bytes per row. </w:t>
       </w:r>
       <w:r>
@@ -3593,7 +3530,6 @@
         </w:rPr>
       </w:pPr>
       <w:r>
-        <w:lastRenderedPageBreak/>
         <w:br w:type="page"/>
       </w:r>
     </w:p>
@@ -3647,15 +3583,7 @@
         <w:t xml:space="preserve">The types of NoSQL </w:t>
       </w:r>
       <w:r>
-        <w:t xml:space="preserve">DBMS </w:t>
-      </w:r>
-      <w:proofErr w:type="gramStart"/>
-      <w:r>
-        <w:t>are:</w:t>
-      </w:r>
-      <w:proofErr w:type="gramEnd"/>
-      <w:r>
-        <w:t xml:space="preserve"> Key / Value pair, document stores, wide-column stores, and graph databases.</w:t>
+        <w:t>DBMS are: Key / Value pair, document stores, wide-column stores, and graph databases.</w:t>
       </w:r>
       <w:r>
         <w:br/>
@@ -3684,23 +3612,7 @@
         <w:t>Document Stores</w:t>
       </w:r>
       <w:r>
-        <w:t xml:space="preserve">: </w:t>
-      </w:r>
-      <w:proofErr w:type="gramStart"/>
-      <w:r>
-        <w:t>Similar to</w:t>
-      </w:r>
-      <w:proofErr w:type="gramEnd"/>
-      <w:r>
-        <w:t xml:space="preserve"> Key </w:t>
-      </w:r>
-      <w:proofErr w:type="gramStart"/>
-      <w:r>
-        <w:t>Value, but</w:t>
-      </w:r>
-      <w:proofErr w:type="gramEnd"/>
-      <w:r>
-        <w:t xml:space="preserve"> stores a structured document (usually JSON) instead of a simple value.</w:t>
+        <w:t>: Similar to Key Value, but stores a structured document (usually JSON) instead of a simple value.</w:t>
       </w:r>
       <w:r>
         <w:t xml:space="preserve">  Great for hierarchical data, or a</w:t>
@@ -3869,7 +3781,16 @@
     </w:p>
     <w:p>
       <w:r>
-        <w:t>Column wide would be best for querying data with easy access to components of each record. This is because the components of the record are stored in organized and grouped sections within the row.  Retrieval of the row is easy via key, and grouping allows for components to be easily accessible.</w:t>
+        <w:t xml:space="preserve">A document store </w:t>
+      </w:r>
+      <w:r>
+        <w:t>is a structured set of data, such as JSON</w:t>
+      </w:r>
+      <w:r>
+        <w:t>, where the individual pieces</w:t>
+      </w:r>
+      <w:r>
+        <w:t>, not just documents or simple values, but anything is stored with an associated key. This allows easy and quick access to the data, with the ability to modify as well.</w:t>
       </w:r>
     </w:p>
     <w:p/>
@@ -4050,7 +3971,22 @@
     </w:p>
     <w:p>
       <w:r>
-        <w:t>Predictive analytics uses historical data to identify patterns and relationships that help explain outcomes. Since President’s Choice wants to understand what factors contributed to the sales decline, it should use predictive analytics. Predictive models can analyze past sales data, customer behavior, promotions, pricing changes, and external factors to determine which variables were most strongly associated with the decline in that specific month.</w:t>
+        <w:t>Diagnostic</w:t>
+      </w:r>
+      <w:r>
+        <w:t xml:space="preserve"> analytics uses historical data to identify patterns and relationships that help explain outcomes. Since President’s Choice wants to understand what factors contributed to the sales decline, it should use </w:t>
+      </w:r>
+      <w:r>
+        <w:t>diagnostic</w:t>
+      </w:r>
+      <w:r>
+        <w:t xml:space="preserve"> analytics. </w:t>
+      </w:r>
+      <w:r>
+        <w:t>Diagnostic</w:t>
+      </w:r>
+      <w:r>
+        <w:t xml:space="preserve"> models can analyze past sales data, customer behavior, promotions, pricing changes, and external factors to determine which variables were most strongly associated with the decline in that specific month.</w:t>
       </w:r>
     </w:p>
     <w:p/>
@@ -4066,45 +4002,36 @@
           <w:b/>
           <w:bCs/>
         </w:rPr>
-        <w:t xml:space="preserve">Ubisoft, which is a video game company, wants to provide all its employees with an </w:t>
-      </w:r>
-      <w:proofErr w:type="gramStart"/>
-      <w:r>
+        <w:t>Ubisoft, which is a video game company, wants to provide all its employees with an up-to-date</w:t>
+      </w:r>
+    </w:p>
+    <w:p>
+      <w:pPr>
         <w:rPr>
           <w:b/>
           <w:bCs/>
         </w:rPr>
-        <w:t>up-to-date</w:t>
-      </w:r>
-      <w:proofErr w:type="gramEnd"/>
-    </w:p>
-    <w:p>
-      <w:pPr>
+      </w:pPr>
+      <w:r>
         <w:rPr>
           <w:b/>
           <w:bCs/>
         </w:rPr>
-      </w:pPr>
-      <w:r>
+        <w:t>graphical representation of the number of downloads of its game products and in-app revenue</w:t>
+      </w:r>
+    </w:p>
+    <w:p>
+      <w:pPr>
         <w:rPr>
           <w:b/>
           <w:bCs/>
         </w:rPr>
-        <w:t>graphical representation of the number of downloads of its game products and in-app revenue</w:t>
-      </w:r>
-    </w:p>
-    <w:p>
-      <w:pPr>
+      </w:pPr>
+      <w:r>
         <w:rPr>
           <w:b/>
           <w:bCs/>
         </w:rPr>
-      </w:pPr>
-      <w:r>
-        <w:rPr>
-          <w:b/>
-          <w:bCs/>
-        </w:rPr>
         <w:t>associated with them.</w:t>
       </w:r>
     </w:p>
@@ -4128,18 +4055,10 @@
         <w:t xml:space="preserve">objective </w:t>
       </w:r>
       <w:r>
-        <w:t xml:space="preserve">representation of </w:t>
-      </w:r>
-      <w:proofErr w:type="gramStart"/>
-      <w:r>
-        <w:t xml:space="preserve">data, </w:t>
-      </w:r>
-      <w:r>
-        <w:t>and</w:t>
-      </w:r>
-      <w:proofErr w:type="gramEnd"/>
-      <w:r>
-        <w:t xml:space="preserve"> does not involve </w:t>
+        <w:t xml:space="preserve">representation of data, </w:t>
+      </w:r>
+      <w:r>
+        <w:t xml:space="preserve">and does not involve </w:t>
       </w:r>
       <w:r>
         <w:t xml:space="preserve">extracting assumptions or predictions out of this data, </w:t>
@@ -5783,6 +5702,7 @@
   <w:style w:type="character" w:default="1" w:styleId="DefaultParagraphFont">
     <w:name w:val="Default Paragraph Font"/>
     <w:uiPriority w:val="1"/>
+    <w:semiHidden/>
     <w:unhideWhenUsed/>
   </w:style>
   <w:style w:type="table" w:default="1" w:styleId="TableNormal">
@@ -6283,6 +6203,94 @@
       <w:szCs w:val="20"/>
     </w:rPr>
   </w:style>
+  <w:style w:type="character" w:styleId="BookTitle">
+    <w:name w:val="Book Title"/>
+    <w:basedOn w:val="DefaultParagraphFont"/>
+    <w:uiPriority w:val="33"/>
+    <w:qFormat/>
+    <w:rsid w:val="00CE5819"/>
+    <w:rPr>
+      <w:b/>
+      <w:bCs/>
+      <w:i/>
+      <w:iCs/>
+      <w:spacing w:val="5"/>
+    </w:rPr>
+  </w:style>
+  <w:style w:type="paragraph" w:styleId="Caption">
+    <w:name w:val="caption"/>
+    <w:basedOn w:val="Normal"/>
+    <w:next w:val="Normal"/>
+    <w:uiPriority w:val="35"/>
+    <w:semiHidden/>
+    <w:unhideWhenUsed/>
+    <w:qFormat/>
+    <w:rsid w:val="00CE5819"/>
+    <w:pPr>
+      <w:spacing w:after="200" w:line="240" w:lineRule="auto"/>
+    </w:pPr>
+    <w:rPr>
+      <w:i/>
+      <w:iCs/>
+      <w:color w:val="0E2841" w:themeColor="text2"/>
+      <w:sz w:val="18"/>
+      <w:szCs w:val="18"/>
+    </w:rPr>
+  </w:style>
+  <w:style w:type="character" w:styleId="Emphasis">
+    <w:name w:val="Emphasis"/>
+    <w:basedOn w:val="DefaultParagraphFont"/>
+    <w:uiPriority w:val="20"/>
+    <w:qFormat/>
+    <w:rsid w:val="00CE5819"/>
+    <w:rPr>
+      <w:i/>
+      <w:iCs/>
+    </w:rPr>
+  </w:style>
+  <w:style w:type="paragraph" w:styleId="NoSpacing">
+    <w:name w:val="No Spacing"/>
+    <w:uiPriority w:val="1"/>
+    <w:qFormat/>
+    <w:rsid w:val="00CE5819"/>
+    <w:pPr>
+      <w:spacing w:after="0" w:line="240" w:lineRule="auto"/>
+    </w:pPr>
+  </w:style>
+  <w:style w:type="character" w:styleId="Strong">
+    <w:name w:val="Strong"/>
+    <w:basedOn w:val="DefaultParagraphFont"/>
+    <w:uiPriority w:val="22"/>
+    <w:qFormat/>
+    <w:rsid w:val="00CE5819"/>
+    <w:rPr>
+      <w:b/>
+      <w:bCs/>
+    </w:rPr>
+  </w:style>
+  <w:style w:type="character" w:styleId="SubtleEmphasis">
+    <w:name w:val="Subtle Emphasis"/>
+    <w:basedOn w:val="DefaultParagraphFont"/>
+    <w:uiPriority w:val="19"/>
+    <w:qFormat/>
+    <w:rsid w:val="00CE5819"/>
+    <w:rPr>
+      <w:i/>
+      <w:iCs/>
+      <w:color w:val="404040" w:themeColor="text1" w:themeTint="BF"/>
+    </w:rPr>
+  </w:style>
+  <w:style w:type="character" w:styleId="SubtleReference">
+    <w:name w:val="Subtle Reference"/>
+    <w:basedOn w:val="DefaultParagraphFont"/>
+    <w:uiPriority w:val="31"/>
+    <w:qFormat/>
+    <w:rsid w:val="00CE5819"/>
+    <w:rPr>
+      <w:smallCaps/>
+      <w:color w:val="5A5A5A" w:themeColor="text1" w:themeTint="A5"/>
+    </w:rPr>
+  </w:style>
 </w:styles>
 </file>
 

</xml_diff>